<commit_message>
Record local home-PC AI hosting preference and pending controller review
</commit_message>
<xml_diff>
--- a/resources/proposal/robot-project-proposal-draft.docx
+++ b/resources/proposal/robot-project-proposal-draft.docx
@@ -231,7 +231,7 @@
           <w:rtl w:val="1"/>
           <w:szCs w:val="22"/>
         </w:rPr>
-        <w:t>כיעד נוסף, בזיהוי חשד למפגע יישמרו תמונה או סרטון קצר ומידע על האירוע, והמידע יישלח לשירות בינה מלאכותית לצורך סימון מפגע אפשרי או אי־ודאות. תוצאת המודל היא המלצה בלבד ואינה אישור בטיחות לבני אדם. זהות המודל ודרך זיהוי החשד ייבחרו בהמשך.</w:t>
+        <w:t>כיעד נוסף, בזיהוי חשד למפגע יישמרו תמונה או סרטון קצר ומידע על האירוע, והמידע יישלח לשירות בינה מלאכותית לצורך סימון מפגע אפשרי או אי־ודאות. תוצאת המודל היא המלצה בלבד ואינה אישור בטיחות לבני אדם. העדפת המשתמש היא להריץ מודל לניתוח תמונות מקומית במחשב הביתי, שיוכל להישאר מופעל בעת הצורך. בחירת המודל זמנית ושמו המדויק טרם אומת. יש לבדוק תמיכה בקלט תמונה, זיכרון וזמן תגובה; דרך זיהוי החשד תוגדר בהמשך.</w:t>
       </w:r>
     </w:p>
     <w:p>
@@ -339,7 +339,7 @@
           <w:rtl w:val="1"/>
           <w:szCs w:val="22"/>
         </w:rPr>
-        <w:t>תת־מערכת צילום מוצעת: מצלמה עם מעבד עצמאי, לכידת תמונות והעברתן. סוג המצלמה והמעבד טרם נבחרו. מצלמה ללא מעבד היא חיישן ואינה כשלעצמה בקר שני. יש לוודא עם המנחה שהחלוקה מספקת שתי מערכות עצמאיות עם קלט, תצוגה, חיישנים, מפעילים ופרוטוקולי תקשורת לפי הדרישות.</w:t>
+        <w:t>תת־מערכת צילום מוצעת: מצלמה עם מעבד עצמאי, לכידת תמונות והעברתן. סוג המצלמה והמעבד טרם נבחרו. מצלמה ללא מעבד היא חיישן ואינה כשלעצמה בקר שני. קבלת החלוקה לפי דרישות הפרויקט נשארת לא ידועה; המשתמש מתכנן לברר בשבוע הבא. יש לוודא עם המנחה שהחלוקה מספקת שתי מערכות עצמאיות עם קלט, תצוגה, חיישנים, מפעילים ופרוטוקולי תקשורת לפי הדרישות.</w:t>
       </w:r>
     </w:p>
     <w:p>
@@ -441,7 +441,7 @@
           <w:rtl w:val="1"/>
           <w:szCs w:val="22"/>
         </w:rPr>
-        <w:t>בעת חשד למפגע יישמר תיעוד עם זמן, מיקום משוער וסיבת הלכידה. שירות הבינה המלאכותית יחזיר הערכה מייעצת: מפגע אפשרי, לא זוהה מפגע או לא ידוע. היעדר זיהוי אינו מוכיח בטיחות. כשאין תשובה תקינה יוצג מצב לא ידוע; עצירה מקומית והימנעות ממכשולים לא ימתינו לשירות.</w:t>
+        <w:t>בעת חשד למפגע יישמר תיעוד עם זמן, מיקום משוער וסיבת הלכידה. שירות הבינה המלאכותית יחזיר הערכה מייעצת: מפגע אפשרי, לא זוהה מפגע או לא ידוע. היעדר זיהוי אינו מוכיח בטיחות. התמונות יקושרו למיקום החשד במפה, אך אינן יכולות להוכיח יציבות מבנית, איכות אוויר או היעדר סכנות נסתרות. כשאין תשובה תקינה יוצג מצב לא ידוע; עצירה מקומית והימנעות ממכשולים לא ימתינו לשירות.</w:t>
       </w:r>
     </w:p>
     <w:p>

</xml_diff>

<commit_message>
Identify Clef-Flash Q8_0 and document verified local inference requirements
</commit_message>
<xml_diff>
--- a/resources/proposal/robot-project-proposal-draft.docx
+++ b/resources/proposal/robot-project-proposal-draft.docx
@@ -231,7 +231,7 @@
           <w:rtl w:val="1"/>
           <w:szCs w:val="22"/>
         </w:rPr>
-        <w:t>כיעד נוסף, בזיהוי חשד למפגע יישמרו תמונה או סרטון קצר ומידע על האירוע, והמידע יישלח לשירות בינה מלאכותית לצורך סימון מפגע אפשרי או אי־ודאות. תוצאת המודל היא המלצה בלבד ואינה אישור בטיחות לבני אדם. העדפת המשתמש היא להריץ מודל לניתוח תמונות מקומית במחשב הביתי, שיוכל להישאר מופעל בעת הצורך. בחירת המודל זמנית ושמו המדויק טרם אומת. יש לבדוק תמיכה בקלט תמונה, זיכרון וזמן תגובה; דרך זיהוי החשד תוגדר בהמשך.</w:t>
+        <w:t>כיעד נוסף, בזיהוי חשד למפגע יישמרו תמונה או סרטון קצר ומידע על האירוע, והמידע יישלח לשירות בינה מלאכותית לצורך סימון מפגע אפשרי או אי־ודאות. תוצאת המודל היא המלצה בלבד ואינה אישור בטיחות לבני אדם. העדפת המשתמש היא להריץ מודל לניתוח תמונות מקומית במחשב הביתי, שיוכל להישאר מופעל בעת הצורך. המודל המיועד הוא Cloudflare Clef-Flash בגרסת Q8_0, שתיעודו כולל קלט תמונה והחלטות מובנות עם הסתברויות. ההרצה במחשב המשתמש טרם נבדקה. יש לבדוק תמיכה בקלט תמונה, זיכרון וזמן תגובה; דרך זיהוי החשד תוגדר בהמשך.</w:t>
       </w:r>
     </w:p>
     <w:p>
@@ -517,7 +517,7 @@
           <w:rtl w:val="1"/>
           <w:szCs w:val="22"/>
         </w:rPr>
-        <w:t>בקר ESP להנעה; מצלמה בעלת מעבד עצמאי או בקר נוסף לפי החלטת המנחה; שני מנועי DC עם מקודדים ודרייבר מתאים; שלדה, גלגלים ותמיכה; חיישני מרחק לפי שיטת המיפוי; ג׳ירוסקופ כאפשרות; סוללה, הגנות וממירי מתח; מחשב נייד; טלפון; רשת אלחוטית; רכיבי תקשורת וחיווט; שירות אינטרנט ושירות AI שטרם נבחרו.</w:t>
+        <w:t>בקר ESP להנעה; מצלמה בעלת מעבד עצמאי או בקר נוסף לפי החלטת המנחה; שני מנועי DC עם מקודדים ודרייבר מתאים; שלדה, גלגלים ותמיכה; חיישני מרחק לפי שיטת המיפוי; ג׳ירוסקופ כאפשרות; סוללה, הגנות וממירי מתח; מחשב נייד; טלפון; רשת אלחוטית; רכיבי תקשורת וחיווט; שירות אינטרנט וסביבת הרצה מקומית עבור Cloudflare Clef-Flash Q8_0.</w:t>
       </w:r>
     </w:p>
     <w:p>
@@ -609,7 +609,7 @@
           <w:rtl w:val="1"/>
           <w:szCs w:val="22"/>
         </w:rPr>
-        <w:t>תקציב, ציוד, זירת ניסוי, מצלמה ומעבד, חיישני מרחק, שירות אינטרנט, שם מודל AI, קריטריונים לחשד למפגע, אישור חלוקת הבקרים, פרטי שער ומועד ההצעה המלא עדיין פתוחים. המועד סביב ה־15 מתייחס להצעה בלבד.</w:t>
+        <w:t>תקציב, ציוד, זירת ניסוי, מצלמה ומעבד, חיישני מרחק, שירות אינטרנט, סביבת הרצה וביצועי מודל AI, קריטריונים לחשד למפגע, אישור חלוקת הבקרים, פרטי שער ומועד ההצעה המלא עדיין פתוחים. המועד סביב ה־15 מתייחס להצעה בלבד.</w:t>
       </w:r>
     </w:p>
     <w:p>

</xml_diff>